<commit_message>
Añade la unidad 14 🧭 Mi futuro FPB (índice + 3 fichas + 3 diagramas)
- Índice con mapa, actividades y el pie de 'Fin del recorrido' heredado de la unidad 13
- Ficha 1 · La brújula: lo que te gusta, lo que se te da bien y lo que valoras (3+3+3)
- Ficha 2 · Los caminos después del FPB: los 6 caminos, elegir con datos y la pregunta de 3 minutos
- Ficha 3 · Tu plan con fecha: la técnica backwards, el plan B y el fail de DANI del 'lo que surja' + dinámica 'El mercado de los futuros'
- 3 diagramas Excalidraw (SVG + PNG + fuentes) y DOCX de la unidad
- La unidad 13 apunta ahora a la 14; sidebar y landing actualizados ('Las 14 unidades')
- DOCX de la unidad 13 regenerado (cambio real de enlaces)

Validación: npm run check 0 errores (57 páginas), build 72 páginas, docx 14/14
</commit_message>
<xml_diff>
--- a/docx/13-bienestar-y-estres/13-bienestar-y-estres.docx
+++ b/docx/13-bienestar-y-estres/13-bienestar-y-estres.docx
@@ -28,7 +28,7 @@
         </w:p>
       </w:sdtContent>
     </w:sdt>
-    <w:bookmarkStart w:id="17" w:name="bienestar-y-estrés"/>
+    <w:bookmarkStart w:id="18" w:name="bienestar-y-estrés"/>
     <w:p>
       <w:pPr>
         <w:pStyle w:val="Heading1"/>
@@ -82,7 +82,7 @@
         <w:t xml:space="preserve"> </w:t>
       </w:r>
       <w:r>
-        <w:t xml:space="preserve">→ Fin del recorrido</w:t>
+        <w:t xml:space="preserve">→ Mi futuro FPB → Fin del recorrido</w:t>
       </w:r>
     </w:p>
     <w:p>
@@ -545,7 +545,7 @@
       </w:r>
     </w:p>
     <w:bookmarkEnd w:id="15"/>
-    <w:bookmarkStart w:id="16" w:name="por-dónde-empiezo"/>
+    <w:bookmarkStart w:id="17" w:name="por-dónde-empiezo"/>
     <w:p>
       <w:pPr>
         <w:pStyle w:val="Heading2"/>
@@ -674,12 +674,43 @@
           <w:b/>
           <w:bCs/>
         </w:rPr>
-        <w:t xml:space="preserve">⏭️ Has terminado el recorrido de tutoría. 🎉 Vuelve cuando quieras a cualquier unidad — el clima del aula se cuida todo el curso, también cuando duermes mal y comparas de más.</w:t>
-      </w:r>
-    </w:p>
-    <w:bookmarkEnd w:id="16"/>
+        <w:t xml:space="preserve">⏭️ Al acabar, continúa en</w:t>
+      </w:r>
+      <w:r>
+        <w:rPr>
+          <w:b/>
+          <w:bCs/>
+        </w:rPr>
+        <w:t xml:space="preserve"> </w:t>
+      </w:r>
+      <w:hyperlink r:id="rId16">
+        <w:r>
+          <w:rPr>
+            <w:rStyle w:val="Hyperlink"/>
+            <w:b/>
+            <w:bCs/>
+          </w:rPr>
+          <w:t xml:space="preserve">🧭 Mi futuro FPB</w:t>
+        </w:r>
+      </w:hyperlink>
+      <w:r>
+        <w:rPr>
+          <w:b/>
+          <w:bCs/>
+        </w:rPr>
+        <w:t xml:space="preserve"> </w:t>
+      </w:r>
+      <w:r>
+        <w:rPr>
+          <w:b/>
+          <w:bCs/>
+        </w:rPr>
+        <w:t xml:space="preserve">— la brújula, los caminos y el plan con fecha.</w:t>
+      </w:r>
+    </w:p>
     <w:bookmarkEnd w:id="17"/>
-    <w:bookmarkStart w:id="34" w:name="descanso-de-verdad"/>
+    <w:bookmarkEnd w:id="18"/>
+    <w:bookmarkStart w:id="35" w:name="descanso-de-verdad"/>
     <w:p>
       <w:pPr>
         <w:pStyle w:val="Heading1"/>
@@ -743,7 +774,7 @@
         </w:pict>
       </w:r>
     </w:p>
-    <w:bookmarkStart w:id="18" w:name="en-corto"/>
+    <w:bookmarkStart w:id="19" w:name="en-corto"/>
     <w:p>
       <w:pPr>
         <w:pStyle w:val="Heading2"/>
@@ -796,8 +827,8 @@
         </w:pict>
       </w:r>
     </w:p>
-    <w:bookmarkEnd w:id="18"/>
-    <w:bookmarkStart w:id="19" w:name="el-turno-de-noche-del-cerebro"/>
+    <w:bookmarkEnd w:id="19"/>
+    <w:bookmarkStart w:id="20" w:name="el-turno-de-noche-del-cerebro"/>
     <w:p>
       <w:pPr>
         <w:pStyle w:val="Heading2"/>
@@ -1092,8 +1123,8 @@
         </w:pict>
       </w:r>
     </w:p>
-    <w:bookmarkEnd w:id="19"/>
-    <w:bookmarkStart w:id="23" w:name="la-cama-no-es-enchufe"/>
+    <w:bookmarkEnd w:id="20"/>
+    <w:bookmarkStart w:id="24" w:name="la-cama-no-es-enchufe"/>
     <w:p>
       <w:pPr>
         <w:pStyle w:val="Heading2"/>
@@ -1257,18 +1288,18 @@
           <wp:inline>
             <wp:extent cx="5334000" cy="2915919"/>
             <wp:effectExtent b="0" l="0" r="0" t="0"/>
-            <wp:docPr descr="🔋 Lo que recarga y lo que no — el balance del turno de noche" title="" id="21" name="Picture"/>
+            <wp:docPr descr="🔋 Lo que recarga y lo que no — el balance del turno de noche" title="" id="22" name="Picture"/>
             <a:graphic>
               <a:graphicData uri="http://schemas.openxmlformats.org/drawingml/2006/picture">
                 <pic:pic>
                   <pic:nvPicPr>
-                    <pic:cNvPr descr="public/img/13-bienestar-y-estres/01-descanso-de-verdad.png" id="22" name="Picture"/>
+                    <pic:cNvPr descr="public/img/13-bienestar-y-estres/01-descanso-de-verdad.png" id="23" name="Picture"/>
                     <pic:cNvPicPr>
                       <a:picLocks noChangeArrowheads="1" noChangeAspect="1"/>
                     </pic:cNvPicPr>
                   </pic:nvPicPr>
                   <pic:blipFill>
-                    <a:blip r:embed="rId20"/>
+                    <a:blip r:embed="rId21"/>
                     <a:stretch>
                       <a:fillRect/>
                     </a:stretch>
@@ -1310,8 +1341,8 @@
         </w:pict>
       </w:r>
     </w:p>
-    <w:bookmarkEnd w:id="23"/>
-    <w:bookmarkStart w:id="24" w:name="la-regla-de-apagado-30-60-0"/>
+    <w:bookmarkEnd w:id="24"/>
+    <w:bookmarkStart w:id="25" w:name="la-regla-de-apagado-30-60-0"/>
     <w:p>
       <w:pPr>
         <w:pStyle w:val="Heading2"/>
@@ -1610,8 +1641,8 @@
         </w:pict>
       </w:r>
     </w:p>
-    <w:bookmarkEnd w:id="24"/>
-    <w:bookmarkStart w:id="25" w:name="el-making-of-vs-el-tráiler-de-tu-día"/>
+    <w:bookmarkEnd w:id="25"/>
+    <w:bookmarkStart w:id="26" w:name="el-making-of-vs-el-tráiler-de-tu-día"/>
     <w:p>
       <w:pPr>
         <w:pStyle w:val="Heading2"/>
@@ -1738,8 +1769,8 @@
         </w:pict>
       </w:r>
     </w:p>
-    <w:bookmarkEnd w:id="25"/>
-    <w:bookmarkStart w:id="26" w:name="X07dcd3b3444ce48e88c8ef9410dd253e1bbae51"/>
+    <w:bookmarkEnd w:id="26"/>
+    <w:bookmarkStart w:id="27" w:name="X07dcd3b3444ce48e88c8ef9410dd253e1bbae51"/>
     <w:p>
       <w:pPr>
         <w:pStyle w:val="Heading2"/>
@@ -1982,8 +2013,8 @@
         </w:pict>
       </w:r>
     </w:p>
-    <w:bookmarkEnd w:id="26"/>
-    <w:bookmarkStart w:id="27" w:name="trabajo-en-equipo-el-pacto-de-apagado"/>
+    <w:bookmarkEnd w:id="27"/>
+    <w:bookmarkStart w:id="28" w:name="trabajo-en-equipo-el-pacto-de-apagado"/>
     <w:p>
       <w:pPr>
         <w:pStyle w:val="Heading2"/>
@@ -2329,8 +2360,8 @@
         <w:t xml:space="preserve">🏫 Grupo:</w:t>
       </w:r>
     </w:p>
-    <w:bookmarkEnd w:id="27"/>
-    <w:bookmarkStart w:id="28" w:name="a-por-ellos"/>
+    <w:bookmarkEnd w:id="28"/>
+    <w:bookmarkStart w:id="29" w:name="a-por-ellos"/>
     <w:p>
       <w:pPr>
         <w:pStyle w:val="Heading2"/>
@@ -2745,8 +2776,8 @@
         </w:pict>
       </w:r>
     </w:p>
-    <w:bookmarkEnd w:id="28"/>
-    <w:bookmarkStart w:id="29" w:name="X5bae659ad1de5ae51d2de4730b07777af0d2e7d"/>
+    <w:bookmarkEnd w:id="29"/>
+    <w:bookmarkStart w:id="30" w:name="X5bae659ad1de5ae51d2de4730b07777af0d2e7d"/>
     <w:p>
       <w:pPr>
         <w:pStyle w:val="Heading2"/>
@@ -2927,8 +2958,8 @@
         </w:pict>
       </w:r>
     </w:p>
-    <w:bookmarkEnd w:id="29"/>
-    <w:bookmarkStart w:id="30" w:name="soluciones-y-pistas"/>
+    <w:bookmarkEnd w:id="30"/>
+    <w:bookmarkStart w:id="31" w:name="soluciones-y-pistas"/>
     <w:p>
       <w:pPr>
         <w:pStyle w:val="Heading2"/>
@@ -3071,8 +3102,8 @@
         </w:pict>
       </w:r>
     </w:p>
-    <w:bookmarkEnd w:id="30"/>
-    <w:bookmarkStart w:id="31" w:name="resumen-en-3-frases"/>
+    <w:bookmarkEnd w:id="31"/>
+    <w:bookmarkStart w:id="32" w:name="resumen-en-3-frases"/>
     <w:p>
       <w:pPr>
         <w:pStyle w:val="Heading2"/>
@@ -3143,8 +3174,8 @@
         </w:pict>
       </w:r>
     </w:p>
-    <w:bookmarkEnd w:id="31"/>
-    <w:bookmarkStart w:id="33" w:name="vocabulario-rápido"/>
+    <w:bookmarkEnd w:id="32"/>
+    <w:bookmarkStart w:id="34" w:name="vocabulario-rápido"/>
     <w:p>
       <w:pPr>
         <w:pStyle w:val="Heading2"/>
@@ -3258,7 +3289,7 @@
       <w:r>
         <w:t xml:space="preserve"> </w:t>
       </w:r>
-      <w:hyperlink r:id="rId32">
+      <w:hyperlink r:id="rId33">
         <w:r>
           <w:rPr>
             <w:rStyle w:val="Hyperlink"/>
@@ -3285,7 +3316,7 @@
       <w:r>
         <w:t xml:space="preserve"> </w:t>
       </w:r>
-      <w:hyperlink r:id="rId32">
+      <w:hyperlink r:id="rId33">
         <w:r>
           <w:rPr>
             <w:rStyle w:val="Hyperlink"/>
@@ -3321,9 +3352,9 @@
         </w:r>
       </w:hyperlink>
     </w:p>
-    <w:bookmarkEnd w:id="33"/>
     <w:bookmarkEnd w:id="34"/>
-    <w:bookmarkStart w:id="50" w:name="presión-y-comparación"/>
+    <w:bookmarkEnd w:id="35"/>
+    <w:bookmarkStart w:id="51" w:name="presión-y-comparación"/>
     <w:p>
       <w:pPr>
         <w:pStyle w:val="Heading1"/>
@@ -3387,7 +3418,7 @@
         </w:pict>
       </w:r>
     </w:p>
-    <w:bookmarkStart w:id="35" w:name="en-corto-1"/>
+    <w:bookmarkStart w:id="36" w:name="en-corto-1"/>
     <w:p>
       <w:pPr>
         <w:pStyle w:val="Heading2"/>
@@ -3459,8 +3490,8 @@
         </w:pict>
       </w:r>
     </w:p>
-    <w:bookmarkEnd w:id="35"/>
-    <w:bookmarkStart w:id="36" w:name="el-escaparate-de-todos"/>
+    <w:bookmarkEnd w:id="36"/>
+    <w:bookmarkStart w:id="37" w:name="el-escaparate-de-todos"/>
     <w:p>
       <w:pPr>
         <w:pStyle w:val="Heading2"/>
@@ -3584,8 +3615,8 @@
         </w:pict>
       </w:r>
     </w:p>
-    <w:bookmarkEnd w:id="36"/>
-    <w:bookmarkStart w:id="40" w:name="la-comparación-injusta"/>
+    <w:bookmarkEnd w:id="37"/>
+    <w:bookmarkStart w:id="41" w:name="la-comparación-injusta"/>
     <w:p>
       <w:pPr>
         <w:pStyle w:val="Heading2"/>
@@ -3603,18 +3634,18 @@
           <wp:inline>
             <wp:extent cx="5334000" cy="3235960"/>
             <wp:effectExtent b="0" l="0" r="0" t="0"/>
-            <wp:docPr descr="📊 Tu peor día contra su día mejor — la comparación con trampa" title="" id="38" name="Picture"/>
+            <wp:docPr descr="📊 Tu peor día contra su día mejor — la comparación con trampa" title="" id="39" name="Picture"/>
             <a:graphic>
               <a:graphicData uri="http://schemas.openxmlformats.org/drawingml/2006/picture">
                 <pic:pic>
                   <pic:nvPicPr>
-                    <pic:cNvPr descr="public/img/13-bienestar-y-estres/02-presion-y-comparacion.png" id="39" name="Picture"/>
+                    <pic:cNvPr descr="public/img/13-bienestar-y-estres/02-presion-y-comparacion.png" id="40" name="Picture"/>
                     <pic:cNvPicPr>
                       <a:picLocks noChangeArrowheads="1" noChangeAspect="1"/>
                     </pic:cNvPicPr>
                   </pic:nvPicPr>
                   <pic:blipFill>
-                    <a:blip r:embed="rId37"/>
+                    <a:blip r:embed="rId38"/>
                     <a:stretch>
                       <a:fillRect/>
                     </a:stretch>
@@ -3813,8 +3844,8 @@
         </w:pict>
       </w:r>
     </w:p>
-    <w:bookmarkEnd w:id="40"/>
-    <w:bookmarkStart w:id="41" w:name="la-presión-de-dos-a-veces"/>
+    <w:bookmarkEnd w:id="41"/>
+    <w:bookmarkStart w:id="42" w:name="la-presión-de-dos-a-veces"/>
     <w:p>
       <w:pPr>
         <w:pStyle w:val="Heading2"/>
@@ -4060,8 +4091,8 @@
         </w:pict>
       </w:r>
     </w:p>
-    <w:bookmarkEnd w:id="41"/>
-    <w:bookmarkStart w:id="42" w:name="silencia-lo-que-te-hace-daño"/>
+    <w:bookmarkEnd w:id="42"/>
+    <w:bookmarkStart w:id="43" w:name="silencia-lo-que-te-hace-daño"/>
     <w:p>
       <w:pPr>
         <w:pStyle w:val="Heading2"/>
@@ -4282,8 +4313,8 @@
         </w:pict>
       </w:r>
     </w:p>
-    <w:bookmarkEnd w:id="42"/>
-    <w:bookmarkStart w:id="43" w:name="Xc2e14c23f5fc318856f9a35ae5e47d58ec75c90"/>
+    <w:bookmarkEnd w:id="43"/>
+    <w:bookmarkStart w:id="44" w:name="Xc2e14c23f5fc318856f9a35ae5e47d58ec75c90"/>
     <w:p>
       <w:pPr>
         <w:pStyle w:val="Heading2"/>
@@ -4537,8 +4568,8 @@
         </w:pict>
       </w:r>
     </w:p>
-    <w:bookmarkEnd w:id="43"/>
-    <w:bookmarkStart w:id="44" w:name="Xcc1b1ee5b66df20a0e6b73feb6678cc8bf826f2"/>
+    <w:bookmarkEnd w:id="44"/>
+    <w:bookmarkStart w:id="45" w:name="Xcc1b1ee5b66df20a0e6b73feb6678cc8bf826f2"/>
     <w:p>
       <w:pPr>
         <w:pStyle w:val="Heading2"/>
@@ -4852,8 +4883,8 @@
         <w:t xml:space="preserve">🏫 Grupo:</w:t>
       </w:r>
     </w:p>
-    <w:bookmarkEnd w:id="44"/>
-    <w:bookmarkStart w:id="45" w:name="a-por-ellos-1"/>
+    <w:bookmarkEnd w:id="45"/>
+    <w:bookmarkStart w:id="46" w:name="a-por-ellos-1"/>
     <w:p>
       <w:pPr>
         <w:pStyle w:val="Heading2"/>
@@ -5238,8 +5269,8 @@
         </w:pict>
       </w:r>
     </w:p>
-    <w:bookmarkEnd w:id="45"/>
-    <w:bookmarkStart w:id="46" w:name="mini-dinámica-el-cartel-retocado-5-min"/>
+    <w:bookmarkEnd w:id="46"/>
+    <w:bookmarkStart w:id="47" w:name="mini-dinámica-el-cartel-retocado-5-min"/>
     <w:p>
       <w:pPr>
         <w:pStyle w:val="Heading2"/>
@@ -5338,8 +5369,8 @@
         </w:pict>
       </w:r>
     </w:p>
-    <w:bookmarkEnd w:id="46"/>
-    <w:bookmarkStart w:id="47" w:name="soluciones-y-pistas-1"/>
+    <w:bookmarkEnd w:id="47"/>
+    <w:bookmarkStart w:id="48" w:name="soluciones-y-pistas-1"/>
     <w:p>
       <w:pPr>
         <w:pStyle w:val="Heading2"/>
@@ -5509,8 +5540,8 @@
         </w:pict>
       </w:r>
     </w:p>
-    <w:bookmarkEnd w:id="47"/>
-    <w:bookmarkStart w:id="48" w:name="resumen-en-3-frases-1"/>
+    <w:bookmarkEnd w:id="48"/>
+    <w:bookmarkStart w:id="49" w:name="resumen-en-3-frases-1"/>
     <w:p>
       <w:pPr>
         <w:pStyle w:val="Heading2"/>
@@ -5562,8 +5593,8 @@
         </w:pict>
       </w:r>
     </w:p>
-    <w:bookmarkEnd w:id="48"/>
-    <w:bookmarkStart w:id="49" w:name="vocabulario-rápido-1"/>
+    <w:bookmarkEnd w:id="49"/>
+    <w:bookmarkStart w:id="50" w:name="vocabulario-rápido-1"/>
     <w:p>
       <w:pPr>
         <w:pStyle w:val="Heading2"/>
@@ -5677,7 +5708,7 @@
       <w:r>
         <w:t xml:space="preserve"> </w:t>
       </w:r>
-      <w:hyperlink r:id="rId32">
+      <w:hyperlink r:id="rId33">
         <w:r>
           <w:rPr>
             <w:rStyle w:val="Hyperlink"/>
@@ -5740,9 +5771,9 @@
         </w:r>
       </w:hyperlink>
     </w:p>
-    <w:bookmarkEnd w:id="49"/>
     <w:bookmarkEnd w:id="50"/>
-    <w:bookmarkStart w:id="74" w:name="pedir-ayuda-a-tiempo"/>
+    <w:bookmarkEnd w:id="51"/>
+    <w:bookmarkStart w:id="75" w:name="pedir-ayuda-a-tiempo"/>
     <w:p>
       <w:pPr>
         <w:pStyle w:val="Heading1"/>
@@ -5806,7 +5837,7 @@
         </w:pict>
       </w:r>
     </w:p>
-    <w:bookmarkStart w:id="51" w:name="en-corto-2"/>
+    <w:bookmarkStart w:id="52" w:name="en-corto-2"/>
     <w:p>
       <w:pPr>
         <w:pStyle w:val="Heading2"/>
@@ -5859,8 +5890,8 @@
         </w:pict>
       </w:r>
     </w:p>
-    <w:bookmarkEnd w:id="51"/>
-    <w:bookmarkStart w:id="52" w:name="el-fail-de-dani-no-quiero-ser-el-pesado"/>
+    <w:bookmarkEnd w:id="52"/>
+    <w:bookmarkStart w:id="53" w:name="el-fail-de-dani-no-quiero-ser-el-pesado"/>
     <w:p>
       <w:pPr>
         <w:pStyle w:val="Heading2"/>
@@ -6130,8 +6161,8 @@
         </w:pict>
       </w:r>
     </w:p>
-    <w:bookmarkEnd w:id="52"/>
-    <w:bookmarkStart w:id="61" w:name="la-escalera-de-la-ayuda"/>
+    <w:bookmarkEnd w:id="53"/>
+    <w:bookmarkStart w:id="62" w:name="la-escalera-de-la-ayuda"/>
     <w:p>
       <w:pPr>
         <w:pStyle w:val="Heading2"/>
@@ -6183,18 +6214,18 @@
           <wp:inline>
             <wp:extent cx="5334000" cy="2169160"/>
             <wp:effectExtent b="0" l="0" r="0" t="0"/>
-            <wp:docPr descr="🪜 De un amigo de fiar al 112 — la escalera de la ayuda" title="" id="54" name="Picture"/>
+            <wp:docPr descr="🪜 De un amigo de fiar al 112 — la escalera de la ayuda" title="" id="55" name="Picture"/>
             <a:graphic>
               <a:graphicData uri="http://schemas.openxmlformats.org/drawingml/2006/picture">
                 <pic:pic>
                   <pic:nvPicPr>
-                    <pic:cNvPr descr="public/img/13-bienestar-y-estres/03-pedir-ayuda-a-tiempo.png" id="55" name="Picture"/>
+                    <pic:cNvPr descr="public/img/13-bienestar-y-estres/03-pedir-ayuda-a-tiempo.png" id="56" name="Picture"/>
                     <pic:cNvPicPr>
                       <a:picLocks noChangeArrowheads="1" noChangeAspect="1"/>
                     </pic:cNvPicPr>
                   </pic:nvPicPr>
                   <pic:blipFill>
-                    <a:blip r:embed="rId53"/>
+                    <a:blip r:embed="rId54"/>
                     <a:stretch>
                       <a:fillRect/>
                     </a:stretch>
@@ -6229,7 +6260,7 @@
         <w:t xml:space="preserve">🪜 De un amigo de fiar al 112 — la escalera de la ayuda</w:t>
       </w:r>
     </w:p>
-    <w:bookmarkStart w:id="56" w:name="peldaño-1-un-amigo-de-fiar"/>
+    <w:bookmarkStart w:id="57" w:name="peldaño-1-un-amigo-de-fiar"/>
     <w:p>
       <w:pPr>
         <w:pStyle w:val="Heading3"/>
@@ -6285,8 +6316,8 @@
         <w:t xml:space="preserve">. Y si no tienes a nadie en el grupo: en casa hay alguien, lo hayas visto poco o mucho.</w:t>
       </w:r>
     </w:p>
-    <w:bookmarkEnd w:id="56"/>
-    <w:bookmarkStart w:id="57" w:name="peldaño-2-familia-o-tutoría"/>
+    <w:bookmarkEnd w:id="57"/>
+    <w:bookmarkStart w:id="58" w:name="peldaño-2-familia-o-tutoría"/>
     <w:p>
       <w:pPr>
         <w:pStyle w:val="Heading3"/>
@@ -6364,8 +6395,8 @@
         <w:t xml:space="preserve">.</w:t>
       </w:r>
     </w:p>
-    <w:bookmarkEnd w:id="57"/>
-    <w:bookmarkStart w:id="58" w:name="peldaño-3-orientación-del-centro"/>
+    <w:bookmarkEnd w:id="58"/>
+    <w:bookmarkStart w:id="59" w:name="peldaño-3-orientación-del-centro"/>
     <w:p>
       <w:pPr>
         <w:pStyle w:val="Heading3"/>
@@ -6417,8 +6448,8 @@
         <w:t xml:space="preserve">: es para cualquiera que necesite hablar algo con alguien que sabe de esto. Pedir la cita no es raro: es de los más valientes del pasillo.</w:t>
       </w:r>
     </w:p>
-    <w:bookmarkEnd w:id="58"/>
-    <w:bookmarkStart w:id="59" w:name="peldaño-4-salud-o-la-024"/>
+    <w:bookmarkEnd w:id="59"/>
+    <w:bookmarkStart w:id="60" w:name="peldaño-4-salud-o-la-024"/>
     <w:p>
       <w:pPr>
         <w:pStyle w:val="Heading3"/>
@@ -6494,8 +6525,8 @@
         <w:t xml:space="preserve">: llaman personas que no saben explicarse, personas que solo necesitan que alguien escuche. También hay chat en la web de la 024.</w:t>
       </w:r>
     </w:p>
-    <w:bookmarkEnd w:id="59"/>
-    <w:bookmarkStart w:id="60" w:name="peldaño-5-112"/>
+    <w:bookmarkEnd w:id="60"/>
+    <w:bookmarkStart w:id="61" w:name="peldaño-5-112"/>
     <w:p>
       <w:pPr>
         <w:pStyle w:val="Heading3"/>
@@ -6599,9 +6630,9 @@
         </w:pict>
       </w:r>
     </w:p>
-    <w:bookmarkEnd w:id="60"/>
     <w:bookmarkEnd w:id="61"/>
-    <w:bookmarkStart w:id="62" w:name="Xd5f8b5b7eaa939c8eb74a3084b85c4d12f55ec6"/>
+    <w:bookmarkEnd w:id="62"/>
+    <w:bookmarkStart w:id="63" w:name="Xd5f8b5b7eaa939c8eb74a3084b85c4d12f55ec6"/>
     <w:p>
       <w:pPr>
         <w:pStyle w:val="Heading2"/>
@@ -6889,8 +6920,8 @@
         </w:pict>
       </w:r>
     </w:p>
-    <w:bookmarkEnd w:id="62"/>
-    <w:bookmarkStart w:id="63" w:name="los-4-mitos-desmontados"/>
+    <w:bookmarkEnd w:id="63"/>
+    <w:bookmarkStart w:id="64" w:name="los-4-mitos-desmontados"/>
     <w:p>
       <w:pPr>
         <w:pStyle w:val="Heading2"/>
@@ -7124,8 +7155,8 @@
         </w:pict>
       </w:r>
     </w:p>
-    <w:bookmarkEnd w:id="63"/>
-    <w:bookmarkStart w:id="64" w:name="cara-a-cara-lo-guardo-vs-lo-cuento"/>
+    <w:bookmarkEnd w:id="64"/>
+    <w:bookmarkStart w:id="65" w:name="cara-a-cara-lo-guardo-vs-lo-cuento"/>
     <w:p>
       <w:pPr>
         <w:pStyle w:val="Heading2"/>
@@ -7369,8 +7400,8 @@
         </w:pict>
       </w:r>
     </w:p>
-    <w:bookmarkEnd w:id="64"/>
-    <w:bookmarkStart w:id="65" w:name="trabajo-en-equipo-la-escalera-en-equipo"/>
+    <w:bookmarkEnd w:id="65"/>
+    <w:bookmarkStart w:id="66" w:name="trabajo-en-equipo-la-escalera-en-equipo"/>
     <w:p>
       <w:pPr>
         <w:pStyle w:val="Heading2"/>
@@ -7872,8 +7903,8 @@
         <w:t xml:space="preserve">🏫 Grupo:</w:t>
       </w:r>
     </w:p>
-    <w:bookmarkEnd w:id="65"/>
-    <w:bookmarkStart w:id="66" w:name="a-por-ellos-2"/>
+    <w:bookmarkEnd w:id="66"/>
+    <w:bookmarkStart w:id="67" w:name="a-por-ellos-2"/>
     <w:p>
       <w:pPr>
         <w:pStyle w:val="Heading2"/>
@@ -8267,8 +8298,8 @@
         </w:pict>
       </w:r>
     </w:p>
-    <w:bookmarkEnd w:id="66"/>
-    <w:bookmarkStart w:id="67" w:name="reto-mental"/>
+    <w:bookmarkEnd w:id="67"/>
+    <w:bookmarkStart w:id="68" w:name="reto-mental"/>
     <w:p>
       <w:pPr>
         <w:pStyle w:val="Heading2"/>
@@ -8513,8 +8544,8 @@
         </w:pict>
       </w:r>
     </w:p>
-    <w:bookmarkEnd w:id="67"/>
-    <w:bookmarkStart w:id="68" w:name="soluciones-y-pistas-2"/>
+    <w:bookmarkEnd w:id="68"/>
+    <w:bookmarkStart w:id="69" w:name="soluciones-y-pistas-2"/>
     <w:p>
       <w:pPr>
         <w:pStyle w:val="Heading2"/>
@@ -8717,8 +8748,8 @@
         </w:pict>
       </w:r>
     </w:p>
-    <w:bookmarkEnd w:id="68"/>
-    <w:bookmarkStart w:id="69" w:name="logros-de-la-unidad"/>
+    <w:bookmarkEnd w:id="69"/>
+    <w:bookmarkStart w:id="70" w:name="logros-de-la-unidad"/>
     <w:p>
       <w:pPr>
         <w:pStyle w:val="Heading2"/>
@@ -8989,8 +9020,8 @@
         </w:pict>
       </w:r>
     </w:p>
-    <w:bookmarkEnd w:id="69"/>
-    <w:bookmarkStart w:id="70" w:name="dudas-de-10-segundos"/>
+    <w:bookmarkEnd w:id="70"/>
+    <w:bookmarkStart w:id="71" w:name="dudas-de-10-segundos"/>
     <w:p>
       <w:pPr>
         <w:pStyle w:val="Heading2"/>
@@ -9225,8 +9256,8 @@
         </w:pict>
       </w:r>
     </w:p>
-    <w:bookmarkEnd w:id="70"/>
-    <w:bookmarkStart w:id="71" w:name="resumen-en-3-frases-2"/>
+    <w:bookmarkEnd w:id="71"/>
+    <w:bookmarkStart w:id="72" w:name="resumen-en-3-frases-2"/>
     <w:p>
       <w:pPr>
         <w:pStyle w:val="Heading2"/>
@@ -9278,8 +9309,8 @@
         </w:pict>
       </w:r>
     </w:p>
-    <w:bookmarkEnd w:id="71"/>
-    <w:bookmarkStart w:id="72" w:name="vocabulario-rápido-2"/>
+    <w:bookmarkEnd w:id="72"/>
+    <w:bookmarkStart w:id="73" w:name="vocabulario-rápido-2"/>
     <w:p>
       <w:pPr>
         <w:pStyle w:val="Heading2"/>
@@ -9383,8 +9414,8 @@
         </w:pict>
       </w:r>
     </w:p>
-    <w:bookmarkEnd w:id="72"/>
-    <w:bookmarkStart w:id="73" w:name="poscréditos"/>
+    <w:bookmarkEnd w:id="73"/>
+    <w:bookmarkStart w:id="74" w:name="poscréditos"/>
     <w:p>
       <w:pPr>
         <w:pStyle w:val="Heading2"/>
@@ -9565,7 +9596,7 @@
       <w:r>
         <w:t xml:space="preserve"> </w:t>
       </w:r>
-      <w:hyperlink r:id="rId32">
+      <w:hyperlink r:id="rId33">
         <w:r>
           <w:rPr>
             <w:rStyle w:val="Hyperlink"/>
@@ -9619,28 +9650,17 @@
       <w:r>
         <w:t xml:space="preserve"> </w:t>
       </w:r>
-      <w:r>
-        <w:t xml:space="preserve">🎉</w:t>
-      </w:r>
-      <w:r>
-        <w:t xml:space="preserve"> </w:t>
-      </w:r>
-      <w:r>
-        <w:rPr>
-          <w:b/>
-          <w:bCs/>
-        </w:rPr>
-        <w:t xml:space="preserve">Fin del recorrido de tutoría</w:t>
-      </w:r>
-      <w:r>
-        <w:t xml:space="preserve"> </w:t>
-      </w:r>
-      <w:r>
-        <w:t xml:space="preserve">— vuelve cuando quieras a cualquier unidad.</w:t>
-      </w:r>
-    </w:p>
-    <w:bookmarkEnd w:id="73"/>
+      <w:hyperlink r:id="rId16">
+        <w:r>
+          <w:rPr>
+            <w:rStyle w:val="Hyperlink"/>
+          </w:rPr>
+          <w:t xml:space="preserve">Mi futuro FPB</w:t>
+        </w:r>
+      </w:hyperlink>
+    </w:p>
     <w:bookmarkEnd w:id="74"/>
+    <w:bookmarkEnd w:id="75"/>
     <w:sectPr>
       <w:footnotePr>
         <w:numRestart w:val="eachSect"/>

</xml_diff>